<commit_message>
Update folder 'Database' - 35 bảng
</commit_message>
<xml_diff>
--- a/Database/Mota/Dac_Ta_CSDL_35_Bang_GiupeViec_v1_Updated.docx
+++ b/Database/Mota/Dac_Ta_CSDL_35_Bang_GiupeViec_v1_Updated.docx
@@ -12026,7 +12026,10 @@
         <w:pStyle w:val="Heading2"/>
       </w:pPr>
       <w:r>
-        <w:t>📌 Bảng: DichVu</w:t>
+        <w:t xml:space="preserve">📌 Bảng: </w:t>
+      </w:r>
+      <w:r>
+        <w:t>LienHe</w:t>
       </w:r>
     </w:p>
     <w:tbl>
@@ -14670,6 +14673,7 @@
   <w:style w:type="character" w:default="1" w:styleId="DefaultParagraphFont">
     <w:name w:val="Default Paragraph Font"/>
     <w:uiPriority w:val="1"/>
+    <w:semiHidden/>
     <w:unhideWhenUsed/>
   </w:style>
   <w:style w:type="table" w:default="1" w:styleId="TableNormal">

</xml_diff>